<commit_message>
CERTAIN-COAST objectives (aim, O1-O6 with targets, deliverables, months; link to state-of-the-art gaps); fixed table widths
Co-Authored-By: Claude Opus 5.5 <noreply@anthropic.com>
Claude-Session: https://claude.ai/code/session_016Cdcj2FTAQGBVsJUyYJR2M
</commit_message>
<xml_diff>
--- a/docs/certain_coast/CERTAIN-COAST_State_of_the_Art.docx
+++ b/docs/certain_coast/CERTAIN-COAST_State_of_the_Art.docx
@@ -389,13 +389,15 @@
         <w:tblStyle w:val="TableGrid"/>
         <w:tblW w:type="auto" w:w="0"/>
         <w:jc w:val="center"/>
+        <w:tblLayout w:type="fixed"/>
         <w:tblLook w:firstColumn="1" w:firstRow="1" w:lastColumn="0" w:lastRow="0" w:noHBand="0" w:noVBand="1" w:val="04A0"/>
+        <w:tblLayout w:type="fixed"/>
       </w:tblPr>
       <w:tblGrid>
-        <w:gridCol w:w="2409"/>
-        <w:gridCol w:w="2409"/>
-        <w:gridCol w:w="2409"/>
-        <w:gridCol w:w="2409"/>
+        <w:gridCol w:w="1474"/>
+        <w:gridCol w:w="3061"/>
+        <w:gridCol w:w="2608"/>
+        <w:gridCol w:w="2494"/>
       </w:tblGrid>
       <w:tr>
         <w:tc>

</xml_diff>